<commit_message>
Refine default templates and clean up PDF storage
</commit_message>
<xml_diff>
--- a/corebackend/sales/default/delivery_note_standard_template.docx
+++ b/corebackend/sales/default/delivery_note_standard_template.docx
@@ -2,6 +2,51 @@
 <file path=word/document.xml><?xml version="1.0" encoding="utf-8"?>
 <w:document xmlns:wpc="http://schemas.microsoft.com/office/word/2010/wordprocessingCanvas" xmlns:mo="http://schemas.microsoft.com/office/mac/office/2008/main" xmlns:mc="http://schemas.openxmlformats.org/markup-compatibility/2006" xmlns:mv="urn:schemas-microsoft-com:mac:vml" xmlns:o="urn:schemas-microsoft-com:office:office" xmlns:r="http://schemas.openxmlformats.org/officeDocument/2006/relationships" xmlns:m="http://schemas.openxmlformats.org/officeDocument/2006/math" xmlns:v="urn:schemas-microsoft-com:vml" xmlns:wp14="http://schemas.microsoft.com/office/word/2010/wordprocessingDrawing" xmlns:wp="http://schemas.openxmlformats.org/drawingml/2006/wordprocessingDrawing" xmlns:w10="urn:schemas-microsoft-com:office:word" xmlns:w="http://schemas.openxmlformats.org/wordprocessingml/2006/main" xmlns:w14="http://schemas.microsoft.com/office/word/2010/wordml" xmlns:wpg="http://schemas.microsoft.com/office/word/2010/wordprocessingGroup" xmlns:wpi="http://schemas.microsoft.com/office/word/2010/wordprocessingInk" xmlns:wne="http://schemas.microsoft.com/office/word/2006/wordml" xmlns:wps="http://schemas.microsoft.com/office/word/2010/wordprocessingShape" mc:Ignorable="w14 wp14">
   <w:body>
+    <w:p>
+      <w:pPr>
+        <w:spacing w:after="80"/>
+        <w:jc w:val="left"/>
+      </w:pPr>
+      <w:r>
+        <w:rPr>
+          <w:rFonts w:ascii="Aptos" w:hAnsi="Aptos"/>
+          <w:b w:val="0"/>
+          <w:color w:val="64748B"/>
+          <w:sz w:val="20"/>
+        </w:rPr>
+        <w:t>[[CompanyLogo]]</w:t>
+      </w:r>
+    </w:p>
+    <w:p>
+      <w:pPr>
+        <w:spacing w:after="0"/>
+        <w:jc w:val="left"/>
+      </w:pPr>
+      <w:r>
+        <w:rPr>
+          <w:rFonts w:ascii="Aptos" w:hAnsi="Aptos"/>
+          <w:b/>
+          <w:color w:val="0F172A"/>
+          <w:sz w:val="44"/>
+        </w:rPr>
+        <w:t>DELIVERY NOTE</w:t>
+      </w:r>
+    </w:p>
+    <w:p>
+      <w:pPr>
+        <w:spacing w:after="200"/>
+        <w:jc w:val="left"/>
+      </w:pPr>
+      <w:r>
+        <w:rPr>
+          <w:rFonts w:ascii="Aptos" w:hAnsi="Aptos"/>
+          <w:b/>
+          <w:color w:val="475569"/>
+          <w:sz w:val="23"/>
+        </w:rPr>
+        <w:t>[[DocumentNumber]]</w:t>
+      </w:r>
+    </w:p>
     <w:tbl>
       <w:tblPr>
         <w:tblW w:type="auto" w:w="0"/>
@@ -9,12 +54,12 @@
         <w:tblLayout w:type="fixed"/>
         <w:tblLook w:firstColumn="1" w:firstRow="1" w:lastColumn="0" w:lastRow="0" w:noHBand="0" w:noVBand="1" w:val="04A0"/>
         <w:tblBorders>
-          <w:top w:val="single" w:sz="0" w:color="FFFFFF"/>
-          <w:left w:val="single" w:sz="0" w:color="FFFFFF"/>
-          <w:bottom w:val="single" w:sz="0" w:color="FFFFFF"/>
-          <w:right w:val="single" w:sz="0" w:color="FFFFFF"/>
-          <w:insideH w:val="single" w:sz="0" w:color="FFFFFF"/>
-          <w:insideV w:val="single" w:sz="0" w:color="FFFFFF"/>
+          <w:top w:val="single" w:sz="8" w:color="D6DFEA"/>
+          <w:left w:val="single" w:sz="8" w:color="D6DFEA"/>
+          <w:bottom w:val="single" w:sz="8" w:color="D6DFEA"/>
+          <w:right w:val="single" w:sz="8" w:color="D6DFEA"/>
+          <w:insideH w:val="single" w:sz="8" w:color="D6DFEA"/>
+          <w:insideV w:val="single" w:sz="8" w:color="D6DFEA"/>
         </w:tblBorders>
       </w:tblPr>
       <w:tblGrid>
@@ -24,100 +69,19 @@
       <w:tr>
         <w:tc>
           <w:tcPr>
-            <w:tcW w:type="dxa" w:w="3168"/>
-            <w:vAlign w:val="center"/>
-          </w:tcPr>
-          <w:p>
-            <w:pPr>
-              <w:jc w:val="left"/>
-            </w:pPr>
-            <w:r/>
-            <w:r>
-              <w:rPr>
-                <w:rFonts w:ascii="Aptos" w:hAnsi="Aptos"/>
-                <w:b w:val="0"/>
-                <w:color w:val="64748B"/>
-                <w:sz w:val="20"/>
-              </w:rPr>
-              <w:t>[[CompanyLogo]]</w:t>
-            </w:r>
-          </w:p>
-        </w:tc>
-        <w:tc>
-          <w:tcPr>
-            <w:tcW w:type="dxa" w:w="6768"/>
-            <w:vAlign w:val="center"/>
-          </w:tcPr>
-          <w:p>
-            <w:pPr>
-              <w:jc w:val="right"/>
-            </w:pPr>
-            <w:r/>
-            <w:r>
-              <w:rPr>
-                <w:rFonts w:ascii="Aptos" w:hAnsi="Aptos"/>
-                <w:b/>
-                <w:color w:val="0F172A"/>
-                <w:sz w:val="44"/>
-              </w:rPr>
-              <w:t>DELIVERY NOTE</w:t>
-            </w:r>
-          </w:p>
-          <w:p>
-            <w:pPr>
-              <w:jc w:val="right"/>
-            </w:pPr>
-            <w:r>
-              <w:rPr>
-                <w:rFonts w:ascii="Aptos" w:hAnsi="Aptos"/>
-                <w:b/>
-                <w:color w:val="475569"/>
-                <w:sz w:val="24"/>
-              </w:rPr>
-              <w:t>[[DocumentNumber]]</w:t>
-            </w:r>
-          </w:p>
-        </w:tc>
-      </w:tr>
-    </w:tbl>
-    <w:p>
-      <w:pPr>
-        <w:spacing w:after="230"/>
-      </w:pPr>
-    </w:p>
-    <w:tbl>
-      <w:tblPr>
-        <w:tblW w:type="auto" w:w="0"/>
-        <w:jc w:val="center"/>
-        <w:tblLayout w:type="fixed"/>
-        <w:tblLook w:firstColumn="1" w:firstRow="1" w:lastColumn="0" w:lastRow="0" w:noHBand="0" w:noVBand="1" w:val="04A0"/>
-        <w:tblBorders>
-          <w:top w:val="single" w:sz="8" w:color="D9E2EC"/>
-          <w:left w:val="single" w:sz="8" w:color="D9E2EC"/>
-          <w:bottom w:val="single" w:sz="8" w:color="D9E2EC"/>
-          <w:right w:val="single" w:sz="8" w:color="D9E2EC"/>
-          <w:insideH w:val="single" w:sz="8" w:color="D9E2EC"/>
-          <w:insideV w:val="single" w:sz="8" w:color="D9E2EC"/>
-        </w:tblBorders>
-      </w:tblPr>
-      <w:tblGrid>
-        <w:gridCol w:w="5328"/>
-        <w:gridCol w:w="5328"/>
-      </w:tblGrid>
-      <w:tr>
-        <w:tc>
-          <w:tcPr>
-            <w:tcW w:type="dxa" w:w="4968"/>
-            <w:shd w:fill="F5F8FC"/>
+            <w:tcW w:type="dxa" w:w="4464"/>
+            <w:vAlign w:val="top"/>
+            <w:shd w:fill="F8FBFE"/>
             <w:tcBorders>
-              <w:top w:val="single" w:sz="8" w:color="D9E2EC"/>
-              <w:left w:val="single" w:sz="8" w:color="D9E2EC"/>
-              <w:bottom w:val="single" w:sz="8" w:color="D9E2EC"/>
-              <w:right w:val="single" w:sz="8" w:color="D9E2EC"/>
+              <w:top w:val="single" w:sz="8" w:color="D6DFEA"/>
+              <w:left w:val="single" w:sz="8" w:color="D6DFEA"/>
+              <w:bottom w:val="single" w:sz="8" w:color="D6DFEA"/>
+              <w:right w:val="single" w:sz="8" w:color="D6DFEA"/>
             </w:tcBorders>
           </w:tcPr>
           <w:p>
             <w:pPr>
+              <w:spacing w:after="40" w:before="0"/>
               <w:jc w:val="left"/>
             </w:pPr>
             <w:r/>
@@ -130,6 +94,12 @@
               </w:rPr>
               <w:t>FROM</w:t>
             </w:r>
+          </w:p>
+          <w:p>
+            <w:pPr>
+              <w:spacing w:after="40" w:before="0"/>
+              <w:jc w:val="left"/>
+            </w:pPr>
             <w:r>
               <w:rPr>
                 <w:rFonts w:ascii="Aptos" w:hAnsi="Aptos"/>
@@ -141,44 +111,96 @@
             </w:r>
           </w:p>
           <w:p>
+            <w:pPr>
+              <w:spacing w:after="40" w:before="0"/>
+              <w:jc w:val="left"/>
+            </w:pPr>
             <w:r>
+              <w:rPr>
+                <w:rFonts w:ascii="Aptos" w:hAnsi="Aptos"/>
+                <w:b w:val="0"/>
+                <w:color w:val="475569"/>
+                <w:sz w:val="21"/>
+              </w:rPr>
               <w:t>[[CompanyAddress]]</w:t>
             </w:r>
           </w:p>
           <w:p>
+            <w:pPr>
+              <w:spacing w:after="40" w:before="0"/>
+              <w:jc w:val="left"/>
+            </w:pPr>
             <w:r>
+              <w:rPr>
+                <w:rFonts w:ascii="Aptos" w:hAnsi="Aptos"/>
+                <w:b w:val="0"/>
+                <w:color w:val="475569"/>
+                <w:sz w:val="21"/>
+              </w:rPr>
               <w:t>[[CompanyEmail]]</w:t>
             </w:r>
           </w:p>
           <w:p>
+            <w:pPr>
+              <w:spacing w:after="40" w:before="0"/>
+              <w:jc w:val="left"/>
+            </w:pPr>
             <w:r>
+              <w:rPr>
+                <w:rFonts w:ascii="Aptos" w:hAnsi="Aptos"/>
+                <w:b w:val="0"/>
+                <w:color w:val="475569"/>
+                <w:sz w:val="21"/>
+              </w:rPr>
               <w:t>[[CompanyPhone]]</w:t>
             </w:r>
           </w:p>
           <w:p>
+            <w:pPr>
+              <w:spacing w:after="40" w:before="0"/>
+              <w:jc w:val="left"/>
+            </w:pPr>
             <w:r>
+              <w:rPr>
+                <w:rFonts w:ascii="Aptos" w:hAnsi="Aptos"/>
+                <w:b w:val="0"/>
+                <w:color w:val="475569"/>
+                <w:sz w:val="21"/>
+              </w:rPr>
               <w:t>[[CompanyWebsite]]</w:t>
             </w:r>
           </w:p>
           <w:p>
+            <w:pPr>
+              <w:spacing w:after="40" w:before="0"/>
+              <w:jc w:val="left"/>
+            </w:pPr>
             <w:r>
+              <w:rPr>
+                <w:rFonts w:ascii="Aptos" w:hAnsi="Aptos"/>
+                <w:b w:val="0"/>
+                <w:color w:val="475569"/>
+                <w:sz w:val="21"/>
+              </w:rPr>
               <w:t>Tax number: [[CompanyTaxNumber]]</w:t>
             </w:r>
           </w:p>
         </w:tc>
         <w:tc>
           <w:tcPr>
-            <w:tcW w:type="dxa" w:w="4968"/>
-            <w:shd w:fill="F5F8FC"/>
+            <w:tcW w:type="dxa" w:w="4464"/>
+            <w:vAlign w:val="top"/>
+            <w:shd w:fill="F8FBFE"/>
             <w:tcBorders>
-              <w:top w:val="single" w:sz="8" w:color="D9E2EC"/>
-              <w:left w:val="single" w:sz="8" w:color="D9E2EC"/>
-              <w:bottom w:val="single" w:sz="8" w:color="D9E2EC"/>
-              <w:right w:val="single" w:sz="8" w:color="D9E2EC"/>
+              <w:top w:val="single" w:sz="8" w:color="D6DFEA"/>
+              <w:left w:val="single" w:sz="8" w:color="D6DFEA"/>
+              <w:bottom w:val="single" w:sz="8" w:color="D6DFEA"/>
+              <w:right w:val="single" w:sz="8" w:color="D6DFEA"/>
             </w:tcBorders>
           </w:tcPr>
           <w:p>
             <w:pPr>
+              <w:spacing w:after="40" w:before="0"/>
               <w:jc w:val="left"/>
             </w:pPr>
             <w:r/>
@@ -191,6 +213,12 @@
               </w:rPr>
               <w:t>DELIVER TO</w:t>
             </w:r>
+          </w:p>
+          <w:p>
+            <w:pPr>
+              <w:spacing w:after="40" w:before="0"/>
+              <w:jc w:val="left"/>
+            </w:pPr>
             <w:r>
               <w:rPr>
                 <w:rFonts w:ascii="Aptos" w:hAnsi="Aptos"/>
@@ -202,7 +230,17 @@
             </w:r>
           </w:p>
           <w:p>
+            <w:pPr>
+              <w:spacing w:after="40" w:before="0"/>
+              <w:jc w:val="left"/>
+            </w:pPr>
             <w:r>
+              <w:rPr>
+                <w:rFonts w:ascii="Aptos" w:hAnsi="Aptos"/>
+                <w:b w:val="0"/>
+                <w:color w:val="475569"/>
+                <w:sz w:val="21"/>
+              </w:rPr>
               <w:t>[[ClientDetails]]</w:t>
             </w:r>
           </w:p>
@@ -211,7 +249,7 @@
     </w:tbl>
     <w:p>
       <w:pPr>
-        <w:spacing w:after="230"/>
+        <w:spacing w:after="120"/>
       </w:pPr>
     </w:p>
     <w:tbl>
@@ -221,12 +259,12 @@
         <w:tblLayout w:type="fixed"/>
         <w:tblLook w:firstColumn="1" w:firstRow="1" w:lastColumn="0" w:lastRow="0" w:noHBand="0" w:noVBand="1" w:val="04A0"/>
         <w:tblBorders>
-          <w:top w:val="single" w:sz="8" w:color="D9E2EC"/>
-          <w:left w:val="single" w:sz="8" w:color="D9E2EC"/>
-          <w:bottom w:val="single" w:sz="8" w:color="D9E2EC"/>
-          <w:right w:val="single" w:sz="8" w:color="D9E2EC"/>
-          <w:insideH w:val="single" w:sz="8" w:color="D9E2EC"/>
-          <w:insideV w:val="single" w:sz="8" w:color="D9E2EC"/>
+          <w:top w:val="single" w:sz="8" w:color="D6DFEA"/>
+          <w:left w:val="single" w:sz="8" w:color="D6DFEA"/>
+          <w:bottom w:val="single" w:sz="8" w:color="D6DFEA"/>
+          <w:right w:val="single" w:sz="8" w:color="D6DFEA"/>
+          <w:insideH w:val="single" w:sz="8" w:color="D6DFEA"/>
+          <w:insideV w:val="single" w:sz="8" w:color="D6DFEA"/>
         </w:tblBorders>
       </w:tblPr>
       <w:tblGrid>
@@ -236,17 +274,18 @@
       <w:tr>
         <w:tc>
           <w:tcPr>
-            <w:tcW w:type="dxa" w:w="4968"/>
-            <w:shd w:fill="E8EEF6"/>
+            <w:tcW w:type="dxa" w:w="4464"/>
+            <w:shd w:fill="EAF1F8"/>
             <w:tcBorders>
-              <w:top w:val="single" w:sz="8" w:color="D9E2EC"/>
-              <w:left w:val="single" w:sz="8" w:color="D9E2EC"/>
-              <w:bottom w:val="single" w:sz="8" w:color="D9E2EC"/>
-              <w:right w:val="single" w:sz="8" w:color="D9E2EC"/>
+              <w:top w:val="single" w:sz="8" w:color="D6DFEA"/>
+              <w:left w:val="single" w:sz="8" w:color="D6DFEA"/>
+              <w:bottom w:val="single" w:sz="8" w:color="D6DFEA"/>
+              <w:right w:val="single" w:sz="8" w:color="D6DFEA"/>
             </w:tcBorders>
           </w:tcPr>
           <w:p>
             <w:pPr>
+              <w:spacing w:after="40" w:before="0"/>
               <w:jc w:val="left"/>
             </w:pPr>
             <w:r/>
@@ -257,23 +296,38 @@
                 <w:color w:val="64748B"/>
                 <w:sz w:val="16"/>
               </w:rPr>
-              <w:t>Issued</w:t>
+              <w:t>ISSUED</w:t>
+            </w:r>
+          </w:p>
+          <w:p>
+            <w:pPr>
+              <w:spacing w:after="40" w:before="0"/>
+              <w:jc w:val="left"/>
+            </w:pPr>
+            <w:r>
+              <w:rPr>
+                <w:rFonts w:ascii="Aptos" w:hAnsi="Aptos"/>
+                <w:b/>
+                <w:color w:val="0F172A"/>
+                <w:sz w:val="24"/>
+              </w:rPr>
             </w:r>
           </w:p>
         </w:tc>
         <w:tc>
           <w:tcPr>
-            <w:tcW w:type="dxa" w:w="4968"/>
-            <w:shd w:fill="E8EEF6"/>
+            <w:tcW w:type="dxa" w:w="4464"/>
+            <w:shd w:fill="EAF1F8"/>
             <w:tcBorders>
-              <w:top w:val="single" w:sz="8" w:color="D9E2EC"/>
-              <w:left w:val="single" w:sz="8" w:color="D9E2EC"/>
-              <w:bottom w:val="single" w:sz="8" w:color="D9E2EC"/>
-              <w:right w:val="single" w:sz="8" w:color="D9E2EC"/>
+              <w:top w:val="single" w:sz="8" w:color="D6DFEA"/>
+              <w:left w:val="single" w:sz="8" w:color="D6DFEA"/>
+              <w:bottom w:val="single" w:sz="8" w:color="D6DFEA"/>
+              <w:right w:val="single" w:sz="8" w:color="D6DFEA"/>
             </w:tcBorders>
           </w:tcPr>
           <w:p>
             <w:pPr>
+              <w:spacing w:after="40" w:before="0"/>
               <w:jc w:val="left"/>
             </w:pPr>
             <w:r/>
@@ -284,7 +338,21 @@
                 <w:color w:val="64748B"/>
                 <w:sz w:val="16"/>
               </w:rPr>
-              <w:t>Delivery date</w:t>
+              <w:t>DELIVERY DATE</w:t>
+            </w:r>
+          </w:p>
+          <w:p>
+            <w:pPr>
+              <w:spacing w:after="40" w:before="0"/>
+              <w:jc w:val="left"/>
+            </w:pPr>
+            <w:r>
+              <w:rPr>
+                <w:rFonts w:ascii="Aptos" w:hAnsi="Aptos"/>
+                <w:b/>
+                <w:color w:val="0F172A"/>
+                <w:sz w:val="24"/>
+              </w:rPr>
             </w:r>
           </w:p>
         </w:tc>
@@ -292,21 +360,26 @@
       <w:tr>
         <w:tc>
           <w:tcPr>
-            <w:tcW w:type="dxa" w:w="4968"/>
+            <w:tcW w:type="dxa" w:w="4464"/>
             <w:tcBorders>
-              <w:top w:val="single" w:sz="8" w:color="D9E2EC"/>
-              <w:left w:val="single" w:sz="8" w:color="D9E2EC"/>
-              <w:bottom w:val="single" w:sz="8" w:color="D9E2EC"/>
-              <w:right w:val="single" w:sz="8" w:color="D9E2EC"/>
+              <w:top w:val="single" w:sz="8" w:color="D6DFEA"/>
+              <w:left w:val="single" w:sz="8" w:color="D6DFEA"/>
+              <w:bottom w:val="single" w:sz="8" w:color="D6DFEA"/>
+              <w:right w:val="single" w:sz="8" w:color="D6DFEA"/>
             </w:tcBorders>
           </w:tcPr>
           <w:p>
+            <w:pPr>
+              <w:spacing w:after="40" w:before="0"/>
+              <w:jc w:val="left"/>
+            </w:pPr>
+            <w:r/>
             <w:r>
               <w:rPr>
                 <w:rFonts w:ascii="Aptos" w:hAnsi="Aptos"/>
                 <w:b/>
                 <w:color w:val="0F172A"/>
-                <w:sz w:val="22"/>
+                <w:sz w:val="21"/>
               </w:rPr>
               <w:t>[[DocumentDate]]</w:t>
             </w:r>
@@ -314,21 +387,26 @@
         </w:tc>
         <w:tc>
           <w:tcPr>
-            <w:tcW w:type="dxa" w:w="4968"/>
+            <w:tcW w:type="dxa" w:w="4464"/>
             <w:tcBorders>
-              <w:top w:val="single" w:sz="8" w:color="D9E2EC"/>
-              <w:left w:val="single" w:sz="8" w:color="D9E2EC"/>
-              <w:bottom w:val="single" w:sz="8" w:color="D9E2EC"/>
-              <w:right w:val="single" w:sz="8" w:color="D9E2EC"/>
+              <w:top w:val="single" w:sz="8" w:color="D6DFEA"/>
+              <w:left w:val="single" w:sz="8" w:color="D6DFEA"/>
+              <w:bottom w:val="single" w:sz="8" w:color="D6DFEA"/>
+              <w:right w:val="single" w:sz="8" w:color="D6DFEA"/>
             </w:tcBorders>
           </w:tcPr>
           <w:p>
+            <w:pPr>
+              <w:spacing w:after="40" w:before="0"/>
+              <w:jc w:val="left"/>
+            </w:pPr>
+            <w:r/>
             <w:r>
               <w:rPr>
                 <w:rFonts w:ascii="Aptos" w:hAnsi="Aptos"/>
                 <w:b/>
                 <w:color w:val="0F172A"/>
-                <w:sz w:val="22"/>
+                <w:sz w:val="21"/>
               </w:rPr>
               <w:t>[[DeliveryDate]]</w:t>
             </w:r>
@@ -338,7 +416,7 @@
     </w:tbl>
     <w:p>
       <w:pPr>
-        <w:spacing w:after="230"/>
+        <w:spacing w:after="120"/>
       </w:pPr>
     </w:p>
     <w:tbl>
@@ -348,12 +426,12 @@
         <w:tblLayout w:type="fixed"/>
         <w:tblLook w:firstColumn="1" w:firstRow="1" w:lastColumn="0" w:lastRow="0" w:noHBand="0" w:noVBand="1" w:val="04A0"/>
         <w:tblBorders>
-          <w:top w:val="single" w:sz="8" w:color="D9E2EC"/>
-          <w:left w:val="single" w:sz="8" w:color="D9E2EC"/>
-          <w:bottom w:val="single" w:sz="8" w:color="D9E2EC"/>
-          <w:right w:val="single" w:sz="8" w:color="D9E2EC"/>
-          <w:insideH w:val="single" w:sz="8" w:color="D9E2EC"/>
-          <w:insideV w:val="single" w:sz="8" w:color="D9E2EC"/>
+          <w:top w:val="single" w:sz="8" w:color="D6DFEA"/>
+          <w:left w:val="single" w:sz="8" w:color="D6DFEA"/>
+          <w:bottom w:val="single" w:sz="8" w:color="D6DFEA"/>
+          <w:right w:val="single" w:sz="8" w:color="D6DFEA"/>
+          <w:insideH w:val="single" w:sz="8" w:color="D6DFEA"/>
+          <w:insideV w:val="single" w:sz="8" w:color="D6DFEA"/>
         </w:tblBorders>
       </w:tblPr>
       <w:tblGrid>
@@ -363,17 +441,18 @@
       <w:tr>
         <w:tc>
           <w:tcPr>
-            <w:tcW w:type="dxa" w:w="5472"/>
-            <w:shd w:fill="E8EEF6"/>
+            <w:tcW w:type="dxa" w:w="7056"/>
+            <w:shd w:fill="EAF1F8"/>
             <w:tcBorders>
-              <w:top w:val="single" w:sz="8" w:color="D9E2EC"/>
-              <w:left w:val="single" w:sz="8" w:color="D9E2EC"/>
-              <w:bottom w:val="single" w:sz="8" w:color="D9E2EC"/>
-              <w:right w:val="single" w:sz="8" w:color="D9E2EC"/>
+              <w:top w:val="single" w:sz="8" w:color="D6DFEA"/>
+              <w:left w:val="single" w:sz="8" w:color="D6DFEA"/>
+              <w:bottom w:val="single" w:sz="8" w:color="D6DFEA"/>
+              <w:right w:val="single" w:sz="8" w:color="D6DFEA"/>
             </w:tcBorders>
           </w:tcPr>
           <w:p>
             <w:pPr>
+              <w:spacing w:after="40" w:before="0"/>
               <w:jc w:val="left"/>
             </w:pPr>
             <w:r/>
@@ -390,17 +469,18 @@
         </w:tc>
         <w:tc>
           <w:tcPr>
-            <w:tcW w:type="dxa" w:w="1296"/>
-            <w:shd w:fill="E8EEF6"/>
+            <w:tcW w:type="dxa" w:w="1872"/>
+            <w:shd w:fill="EAF1F8"/>
             <w:tcBorders>
-              <w:top w:val="single" w:sz="8" w:color="D9E2EC"/>
-              <w:left w:val="single" w:sz="8" w:color="D9E2EC"/>
-              <w:bottom w:val="single" w:sz="8" w:color="D9E2EC"/>
-              <w:right w:val="single" w:sz="8" w:color="D9E2EC"/>
+              <w:top w:val="single" w:sz="8" w:color="D6DFEA"/>
+              <w:left w:val="single" w:sz="8" w:color="D6DFEA"/>
+              <w:bottom w:val="single" w:sz="8" w:color="D6DFEA"/>
+              <w:right w:val="single" w:sz="8" w:color="D6DFEA"/>
             </w:tcBorders>
           </w:tcPr>
           <w:p>
             <w:pPr>
+              <w:spacing w:after="40" w:before="0"/>
               <w:jc w:val="center"/>
             </w:pPr>
             <w:r/>
@@ -419,16 +499,17 @@
       <w:tr>
         <w:tc>
           <w:tcPr>
-            <w:tcW w:type="dxa" w:w="5472"/>
+            <w:tcW w:type="dxa" w:w="7056"/>
             <w:tcBorders>
-              <w:top w:val="single" w:sz="8" w:color="D9E2EC"/>
-              <w:left w:val="single" w:sz="8" w:color="D9E2EC"/>
-              <w:bottom w:val="single" w:sz="8" w:color="D9E2EC"/>
-              <w:right w:val="single" w:sz="8" w:color="D9E2EC"/>
+              <w:top w:val="single" w:sz="8" w:color="D6DFEA"/>
+              <w:left w:val="single" w:sz="8" w:color="D6DFEA"/>
+              <w:bottom w:val="single" w:sz="8" w:color="D6DFEA"/>
+              <w:right w:val="single" w:sz="8" w:color="D6DFEA"/>
             </w:tcBorders>
           </w:tcPr>
           <w:p>
             <w:pPr>
+              <w:spacing w:after="40" w:before="0"/>
               <w:jc w:val="left"/>
             </w:pPr>
             <w:r/>
@@ -445,16 +526,17 @@
         </w:tc>
         <w:tc>
           <w:tcPr>
-            <w:tcW w:type="dxa" w:w="1296"/>
+            <w:tcW w:type="dxa" w:w="1872"/>
             <w:tcBorders>
-              <w:top w:val="single" w:sz="8" w:color="D9E2EC"/>
-              <w:left w:val="single" w:sz="8" w:color="D9E2EC"/>
-              <w:bottom w:val="single" w:sz="8" w:color="D9E2EC"/>
-              <w:right w:val="single" w:sz="8" w:color="D9E2EC"/>
+              <w:top w:val="single" w:sz="8" w:color="D6DFEA"/>
+              <w:left w:val="single" w:sz="8" w:color="D6DFEA"/>
+              <w:bottom w:val="single" w:sz="8" w:color="D6DFEA"/>
+              <w:right w:val="single" w:sz="8" w:color="D6DFEA"/>
             </w:tcBorders>
           </w:tcPr>
           <w:p>
             <w:pPr>
+              <w:spacing w:after="40" w:before="0"/>
               <w:jc w:val="center"/>
             </w:pPr>
             <w:r/>
@@ -473,7 +555,7 @@
     </w:tbl>
     <w:p>
       <w:pPr>
-        <w:spacing w:after="230"/>
+        <w:spacing w:after="120"/>
       </w:pPr>
     </w:p>
     <w:tbl>
@@ -483,12 +565,12 @@
         <w:tblLayout w:type="fixed"/>
         <w:tblLook w:firstColumn="1" w:firstRow="1" w:lastColumn="0" w:lastRow="0" w:noHBand="0" w:noVBand="1" w:val="04A0"/>
         <w:tblBorders>
-          <w:top w:val="single" w:sz="8" w:color="D9E2EC"/>
-          <w:left w:val="single" w:sz="8" w:color="D9E2EC"/>
-          <w:bottom w:val="single" w:sz="8" w:color="D9E2EC"/>
-          <w:right w:val="single" w:sz="8" w:color="D9E2EC"/>
-          <w:insideH w:val="single" w:sz="8" w:color="D9E2EC"/>
-          <w:insideV w:val="single" w:sz="8" w:color="D9E2EC"/>
+          <w:top w:val="single" w:sz="8" w:color="D6DFEA"/>
+          <w:left w:val="single" w:sz="8" w:color="D6DFEA"/>
+          <w:bottom w:val="single" w:sz="8" w:color="D6DFEA"/>
+          <w:right w:val="single" w:sz="8" w:color="D6DFEA"/>
+          <w:insideH w:val="single" w:sz="8" w:color="D6DFEA"/>
+          <w:insideV w:val="single" w:sz="8" w:color="D6DFEA"/>
         </w:tblBorders>
       </w:tblPr>
       <w:tblGrid>
@@ -497,11 +579,12 @@
       <w:tr>
         <w:tc>
           <w:tcPr>
-            <w:tcW w:type="dxa" w:w="9936"/>
-            <w:shd w:fill="E8EEF6"/>
+            <w:tcW w:type="dxa" w:w="8928"/>
+            <w:shd w:fill="EAF1F8"/>
           </w:tcPr>
           <w:p>
             <w:pPr>
+              <w:spacing w:after="40" w:before="0"/>
               <w:jc w:val="left"/>
             </w:pPr>
             <w:r/>
@@ -510,7 +593,7 @@
                 <w:rFonts w:ascii="Aptos" w:hAnsi="Aptos"/>
                 <w:b/>
                 <w:color w:val="64748B"/>
-                <w:sz w:val="16"/>
+                <w:sz w:val="17"/>
               </w:rPr>
               <w:t>DELIVERY NOTES</w:t>
             </w:r>
@@ -520,9 +603,14 @@
       <w:tr>
         <w:tc>
           <w:tcPr>
-            <w:tcW w:type="dxa" w:w="9936"/>
+            <w:tcW w:type="dxa" w:w="8928"/>
           </w:tcPr>
           <w:p>
+            <w:pPr>
+              <w:spacing w:after="40" w:before="0"/>
+              <w:jc w:val="left"/>
+            </w:pPr>
+            <w:r/>
             <w:r>
               <w:rPr>
                 <w:rFonts w:ascii="Aptos" w:hAnsi="Aptos"/>

</xml_diff>